<commit_message>
docs: add content 3.2. Thiết kế kho dữ liệu
</commit_message>
<xml_diff>
--- a/reports/words/chuong_3.docx
+++ b/reports/words/chuong_3.docx
@@ -3,36 +3,57 @@
 <w:document xmlns:wpc="http://schemas.microsoft.com/office/word/2010/wordprocessingCanvas" xmlns:cx="http://schemas.microsoft.com/office/drawing/2014/chartex" xmlns:cx1="http://schemas.microsoft.com/office/drawing/2015/9/8/chartex" xmlns:cx2="http://schemas.microsoft.com/office/drawing/2015/10/21/chartex" xmlns:cx3="http://schemas.microsoft.com/office/drawing/2016/5/9/chartex" xmlns:cx4="http://schemas.microsoft.com/office/drawing/2016/5/10/chartex" xmlns:cx5="http://schemas.microsoft.com/office/drawing/2016/5/11/chartex" xmlns:cx6="http://schemas.microsoft.com/office/drawing/2016/5/12/chartex" xmlns:cx7="http://schemas.microsoft.com/office/drawing/2016/5/13/chartex" xmlns:cx8="http://schemas.microsoft.com/office/drawing/2016/5/14/chartex" xmlns:mc="http://schemas.openxmlformats.org/markup-compatibility/2006" xmlns:aink="http://schemas.microsoft.com/office/drawing/2016/ink" xmlns:am3d="http://schemas.microsoft.com/office/drawing/2017/model3d" xmlns:o="urn:schemas-microsoft-com:office:office" xmlns:oel="http://schemas.microsoft.com/office/2019/extlst" xmlns:r="http://schemas.openxmlformats.org/officeDocument/2006/relationships" xmlns:m="http://schemas.openxmlformats.org/officeDocument/2006/math" xmlns:v="urn:schemas-microsoft-com:vml" xmlns:wp14="http://schemas.microsoft.com/office/word/2010/wordprocessingDrawing" xmlns:wp="http://schemas.openxmlformats.org/drawingml/2006/wordprocessingDrawing" xmlns:w10="urn:schemas-microsoft-com:office:word" xmlns:w="http://schemas.openxmlformats.org/wordprocessingml/2006/main" xmlns:w14="http://schemas.microsoft.com/office/word/2010/wordml" xmlns:w15="http://schemas.microsoft.com/office/word/2012/wordml" xmlns:w16cex="http://schemas.microsoft.com/office/word/2018/wordml/cex" xmlns:w16cid="http://schemas.microsoft.com/office/word/2016/wordml/cid" xmlns:w16="http://schemas.microsoft.com/office/word/2018/wordml" xmlns:w16du="http://schemas.microsoft.com/office/word/2023/wordml/word16du" xmlns:w16sdtdh="http://schemas.microsoft.com/office/word/2020/wordml/sdtdatahash" xmlns:w16sdtfl="http://schemas.microsoft.com/office/word/2024/wordml/sdtformatlock" xmlns:w16se="http://schemas.microsoft.com/office/word/2015/wordml/symex" xmlns:wpg="http://schemas.microsoft.com/office/word/2010/wordprocessingGroup" xmlns:wpi="http://schemas.microsoft.com/office/word/2010/wordprocessingInk" xmlns:wne="http://schemas.microsoft.com/office/word/2006/wordml" xmlns:wps="http://schemas.microsoft.com/office/word/2010/wordprocessingShape" mc:Ignorable="w14 w15 w16se w16cid w16 w16cex w16sdtdh w16sdtfl w16du wp14">
   <w:body>
     <w:p>
+      <w:pPr>
+        <w:pStyle w:val="Heading1"/>
+      </w:pPr>
       <w:r>
         <w:t>CHƯƠNG 3. CÀI ĐẶT THỰC NGHIỆM</w:t>
       </w:r>
     </w:p>
     <w:p>
+      <w:pPr>
+        <w:pStyle w:val="Heading2"/>
+      </w:pPr>
       <w:r>
         <w:t>3.1. Giới thiệu bộ dữ liệu</w:t>
       </w:r>
     </w:p>
     <w:p>
+      <w:pPr>
+        <w:pStyle w:val="Heading3"/>
+      </w:pPr>
       <w:r>
         <w:t>3.1.1. Dataset Maven Fuzzy Factory</w:t>
       </w:r>
     </w:p>
     <w:p>
+      <w:pPr>
+        <w:jc w:val="both"/>
+      </w:pPr>
       <w:r>
         <w:t>Bộ dữ liệu được sử dụng trong đề tài là Maven Fuzzy Factory, một bộ dữ liệu mô phỏng hoạt động kinh doanh thương mại điện tử của một doanh nghiệp bán đồ chơi trực tuyến. Dữ liệu phản ánh quá trình vận hành của một cửa hàng đồ chơi giả định, bao gồm các hoạt động chính như truy cập website, xem trang sản phẩm, phát sinh đơn hàng, mua sản phẩm và hoàn tiền. Đây là bộ dữ liệu phù hợp để xây dựng hệ thống phân tích dữ liệu thương mại điện tử vì nó thể hiện đầy đủ mối quan hệ giữa hành vi người dùng, hiệu quả marketing, hoạt động bán hàng và hiệu quả kinh doanh.</w:t>
       </w:r>
     </w:p>
     <w:p>
+      <w:pPr>
+        <w:jc w:val="both"/>
+      </w:pPr>
       <w:r>
         <w:t>Về phạm vi thời gian, bộ dữ liệu bao phủ giai đoạn từ tháng 03/2012 đến tháng 04/2015. Khoảng thời gian này đủ dài để quan sát xu hướng kinh doanh, sự thay đổi hành vi truy cập, biến động doanh thu theo thời gian, hiệu quả của các chiến dịch marketing và mức độ tiêu thụ của từng sản phẩm. Do đó, dữ liệu không chỉ phục vụ cho phân tích mô tả mà còn có thể được sử dụng để xây dựng kho dữ liệu, mô hình OLAP, dashboard trực quan hóa và các bài toán học máy trong giai đoạn mở rộng.</w:t>
       </w:r>
     </w:p>
     <w:p>
+      <w:pPr>
+        <w:jc w:val="both"/>
+      </w:pPr>
       <w:r>
         <w:t>Trong đề tài này, bộ dữ liệu được tổ chức theo quy trình từ dữ liệu thô dạng CSV, nạp vào cơ sở dữ liệu quan hệ SQL Server theo mô hình OLTP, sau đó được xử lý thông qua ETL bằng SSIS để xây dựng kho dữ liệu theo mô hình hình sao. Cách tiếp cận này phù hợp với định hướng của một hệ thống phân tích dữ liệu doanh nghiệp, trong đó dữ liệu giao dịch ban đầu được chuẩn hóa để lưu trữ, sau đó được chuyển đổi thành cấu trúc tối ưu cho truy vấn phân tích.</w:t>
       </w:r>
     </w:p>
     <w:p>
+      <w:pPr>
+        <w:pStyle w:val="Heading3"/>
+      </w:pPr>
       <w:r>
         <w:t xml:space="preserve">3.1.2. </w:t>
       </w:r>
@@ -41,6 +62,9 @@
       </w:r>
     </w:p>
     <w:p>
+      <w:pPr>
+        <w:jc w:val="both"/>
+      </w:pPr>
       <w:r>
         <w:t>Data Dictionary đóng vai trò mô tả ý nghĩa của các bảng và các trường dữ liệu trong hệ thống. Đối với bộ dữ liệu Maven Fuzzy Factory, Data Dictionary giúp xác định rõ từng thực thể nghiệp vụ, khóa định danh, thuộc tính mô tả và mối quan hệ giữa các bảng. Đây là cơ sở quan trọng để thiết kế cơ sở dữ liệu OLTP, xây dựng khóa chính, khóa ngoại, đồng thời triển khai quy trình ETL sang kho dữ liệu</w:t>
       </w:r>
@@ -50,6 +74,61 @@
     </w:p>
     <w:p>
       <w:r>
+        <w:rPr>
+          <w:noProof/>
+        </w:rPr>
+        <w:drawing>
+          <wp:inline distT="0" distB="0" distL="0" distR="0" wp14:anchorId="7EABC72B" wp14:editId="03DF2096">
+            <wp:extent cx="5608838" cy="2694709"/>
+            <wp:effectExtent l="0" t="0" r="0" b="0"/>
+            <wp:docPr id="930146578" name="Picture 2"/>
+            <wp:cNvGraphicFramePr>
+              <a:graphicFrameLocks xmlns:a="http://schemas.openxmlformats.org/drawingml/2006/main" noChangeAspect="1"/>
+            </wp:cNvGraphicFramePr>
+            <a:graphic xmlns:a="http://schemas.openxmlformats.org/drawingml/2006/main">
+              <a:graphicData uri="http://schemas.openxmlformats.org/drawingml/2006/picture">
+                <pic:pic xmlns:pic="http://schemas.openxmlformats.org/drawingml/2006/picture">
+                  <pic:nvPicPr>
+                    <pic:cNvPr id="930146578" name="Picture 930146578"/>
+                    <pic:cNvPicPr/>
+                  </pic:nvPicPr>
+                  <pic:blipFill>
+                    <a:blip r:embed="rId6">
+                      <a:extLst>
+                        <a:ext uri="{28A0092B-C50C-407E-A947-70E740481C1C}">
+                          <a14:useLocalDpi xmlns:a14="http://schemas.microsoft.com/office/drawing/2010/main" val="0"/>
+                        </a:ext>
+                      </a:extLst>
+                    </a:blip>
+                    <a:stretch>
+                      <a:fillRect/>
+                    </a:stretch>
+                  </pic:blipFill>
+                  <pic:spPr>
+                    <a:xfrm>
+                      <a:off x="0" y="0"/>
+                      <a:ext cx="5654384" cy="2716591"/>
+                    </a:xfrm>
+                    <a:prstGeom prst="rect">
+                      <a:avLst/>
+                    </a:prstGeom>
+                  </pic:spPr>
+                </pic:pic>
+              </a:graphicData>
+            </a:graphic>
+          </wp:inline>
+        </w:drawing>
+      </w:r>
+      <w:r>
+        <w:t xml:space="preserve">Hình 3.1. </w:t>
+      </w:r>
+      <w:r>
+        <w:t>Sơ đồ ERD của bộ dữ liệu</w:t>
+      </w:r>
+    </w:p>
+    <w:p>
+      <w:r>
+        <w:lastRenderedPageBreak/>
         <w:t xml:space="preserve">Đặc điểm quan trọng của bộ dữ liệu này là tính đa chiều, bao gồm hơn 1,1 triệu lượt xem trang, 472.871 phiên truy cập và hơn 32.000 đơn hàng thành công. Việc sử dụng bộ dữ liệu này cho phép thực hiện các phân tích chuyên sâu về hiệu quả marketing, hành vi người dùng và tối ưu hóa tỷ lệ chuyển đổi. </w:t>
       </w:r>
     </w:p>
@@ -343,7 +422,6 @@
           </w:tcPr>
           <w:p>
             <w:r>
-              <w:lastRenderedPageBreak/>
               <w:t>utm_content</w:t>
             </w:r>
           </w:p>
@@ -452,7 +530,6 @@
         </w:tc>
       </w:tr>
     </w:tbl>
-    <w:p/>
     <w:p>
       <w:r>
         <w:t>Bảng website_pageviews lưu trữ dữ liệu chi tiết ở cấp độ sự kiện, ghi lại toàn bộ hành trình tuyến tính của khách hàng thông qua từng lượt xem trang cụ thể trong suốt một phiên làm việc.</w:t>
@@ -550,10 +627,7 @@
           </w:tcPr>
           <w:p>
             <w:r>
-              <w:t>Khóa chính</w:t>
-            </w:r>
-            <w:r>
-              <w:t xml:space="preserve"> (PK)</w:t>
+              <w:t>Khóa chính (PK)</w:t>
             </w:r>
           </w:p>
         </w:tc>
@@ -1014,8 +1088,15 @@
         </w:tc>
       </w:tr>
     </w:tbl>
-    <w:p>
-      <w:r>
+    <w:p/>
+    <w:p>
+      <w:r>
+        <w:br w:type="page"/>
+      </w:r>
+    </w:p>
+    <w:p>
+      <w:r>
+        <w:lastRenderedPageBreak/>
         <w:t>Bảng order_items thực hiện nhiệm vụ phân rã cấu trúc của bảng đơn hàng thành các dòng dữ liệu chi tiết cho từng mặt hàng cụ thể được giao dịch thành công.</w:t>
       </w:r>
     </w:p>
@@ -1429,19 +1510,7 @@
           </w:tcPr>
           <w:p>
             <w:r>
-              <w:t xml:space="preserve">Khóa </w:t>
-            </w:r>
-            <w:r>
-              <w:t>chính</w:t>
-            </w:r>
-            <w:r>
-              <w:t xml:space="preserve"> (</w:t>
-            </w:r>
-            <w:r>
-              <w:t>P</w:t>
-            </w:r>
-            <w:r>
-              <w:t>K)</w:t>
+              <w:t>Khóa chính (PK)</w:t>
             </w:r>
           </w:p>
         </w:tc>
@@ -1453,7 +1522,6 @@
           </w:tcPr>
           <w:p>
             <w:r>
-              <w:lastRenderedPageBreak/>
               <w:t>created_at</w:t>
             </w:r>
           </w:p>
@@ -1520,7 +1588,6 @@
         </w:tc>
       </w:tr>
     </w:tbl>
-    <w:p/>
     <w:p>
       <w:r>
         <w:t>Bảng order_item_refunds đại diện cho phân đoạn hậu mãi trong chuỗi vận hành thương mại điện tử, ghi nhận toàn bộ các sự kiện hoàn trả hàng hóa và bồi hoàn tài chính từ phía khách hàng.</w:t>
@@ -1693,19 +1760,7 @@
           </w:tcPr>
           <w:p>
             <w:r>
-              <w:t xml:space="preserve">Khóa </w:t>
-            </w:r>
-            <w:r>
-              <w:t>ngoại</w:t>
-            </w:r>
-            <w:r>
-              <w:t xml:space="preserve"> (</w:t>
-            </w:r>
-            <w:r>
-              <w:t>F</w:t>
-            </w:r>
-            <w:r>
-              <w:t>K)</w:t>
+              <w:t>Khóa ngoại (FK)</w:t>
             </w:r>
           </w:p>
         </w:tc>
@@ -1783,6 +1838,352 @@
         </w:tc>
       </w:tr>
     </w:tbl>
+    <w:p>
+      <w:pPr>
+        <w:pStyle w:val="Heading2"/>
+      </w:pPr>
+      <w:r>
+        <w:t>3.2. Thiết kế hệ thống</w:t>
+      </w:r>
+    </w:p>
+    <w:p>
+      <w:r>
+        <w:t>Trong các hệ thống phân tích dữ liệu hiện đại, việc xây dựng một kiến trúc xử lý dữ liệu hoàn chỉnh đóng vai trò quan trọng nhằm đảm bảo khả năng thu thập, lưu trữ, xử lý và khai thác dữ liệu một cách hiệu quả. Đối với dự án Maven Fuzzy Factory, hệ thống được thiết kế theo mô hình xử lý dữ liệu nhiều tầng, bao gồm các thành phần từ nguồn dữ liệu ban đầu đến các ứng dụng phân tích và dự báo.</w:t>
+      </w:r>
+    </w:p>
+    <w:p>
+      <w:r>
+        <w:rPr>
+          <w:noProof/>
+        </w:rPr>
+        <w:lastRenderedPageBreak/>
+        <w:drawing>
+          <wp:inline distT="0" distB="0" distL="0" distR="0" wp14:anchorId="428559EA" wp14:editId="05145131">
+            <wp:extent cx="5014196" cy="3435928"/>
+            <wp:effectExtent l="0" t="0" r="0" b="0"/>
+            <wp:docPr id="677765231" name="Picture 1"/>
+            <wp:cNvGraphicFramePr>
+              <a:graphicFrameLocks xmlns:a="http://schemas.openxmlformats.org/drawingml/2006/main" noChangeAspect="1"/>
+            </wp:cNvGraphicFramePr>
+            <a:graphic xmlns:a="http://schemas.openxmlformats.org/drawingml/2006/main">
+              <a:graphicData uri="http://schemas.openxmlformats.org/drawingml/2006/picture">
+                <pic:pic xmlns:pic="http://schemas.openxmlformats.org/drawingml/2006/picture">
+                  <pic:nvPicPr>
+                    <pic:cNvPr id="677765231" name="Picture 677765231"/>
+                    <pic:cNvPicPr/>
+                  </pic:nvPicPr>
+                  <pic:blipFill rotWithShape="1">
+                    <a:blip r:embed="rId7">
+                      <a:extLst>
+                        <a:ext uri="{28A0092B-C50C-407E-A947-70E740481C1C}">
+                          <a14:useLocalDpi xmlns:a14="http://schemas.microsoft.com/office/drawing/2010/main" val="0"/>
+                        </a:ext>
+                      </a:extLst>
+                    </a:blip>
+                    <a:srcRect b="12046"/>
+                    <a:stretch>
+                      <a:fillRect/>
+                    </a:stretch>
+                  </pic:blipFill>
+                  <pic:spPr bwMode="auto">
+                    <a:xfrm>
+                      <a:off x="0" y="0"/>
+                      <a:ext cx="5025984" cy="3444006"/>
+                    </a:xfrm>
+                    <a:prstGeom prst="rect">
+                      <a:avLst/>
+                    </a:prstGeom>
+                    <a:ln>
+                      <a:noFill/>
+                    </a:ln>
+                    <a:extLst>
+                      <a:ext uri="{53640926-AAD7-44D8-BBD7-CCE9431645EC}">
+                        <a14:shadowObscured xmlns:a14="http://schemas.microsoft.com/office/drawing/2010/main"/>
+                      </a:ext>
+                    </a:extLst>
+                  </pic:spPr>
+                </pic:pic>
+              </a:graphicData>
+            </a:graphic>
+          </wp:inline>
+        </w:drawing>
+      </w:r>
+    </w:p>
+    <w:p>
+      <w:r>
+        <w:t>Hình 3.2. Sơ đồ luồng dữ liệu Data Warehouse</w:t>
+      </w:r>
+    </w:p>
+    <w:p>
+      <w:r>
+        <w:t>Quy trình xử lý dữ liệu được thực hiện qua các giai đoạn sau:</w:t>
+      </w:r>
+    </w:p>
+    <w:p>
+      <w:pPr>
+        <w:pStyle w:val="ListParagraph"/>
+        <w:numPr>
+          <w:ilvl w:val="0"/>
+          <w:numId w:val="2"/>
+        </w:numPr>
+      </w:pPr>
+      <w:r>
+        <w:t>Giai đoạn 1</w:t>
+      </w:r>
+      <w:r>
+        <w:t xml:space="preserve">: </w:t>
+      </w:r>
+      <w:r>
+        <w:t>Thu thập dữ liệu</w:t>
+      </w:r>
+      <w:r>
+        <w:t>.</w:t>
+      </w:r>
+    </w:p>
+    <w:p>
+      <w:pPr>
+        <w:pStyle w:val="ListParagraph"/>
+        <w:numPr>
+          <w:ilvl w:val="1"/>
+          <w:numId w:val="2"/>
+        </w:numPr>
+      </w:pPr>
+      <w:r>
+        <w:t>Nguồn dữ liệu ban đầu của hệ thống được cung cấp dưới dạng các tệp CSV chứa dữ liệu hoạt động của website thương mại điện tử Maven Fuzzy Factory. Các tập dữ liệu bao gồm thông tin về phiên truy cập website, lượt xem trang, đơn hàng, sản phẩm, chi tiết đơn hàng và hoàn trả sản phẩm. Đây là nguồn dữ liệu giao dịch gốc phản ánh toàn bộ hoạt động kinh doanh của doanh nghiệp.</w:t>
+      </w:r>
+    </w:p>
+    <w:p>
+      <w:pPr>
+        <w:pStyle w:val="ListParagraph"/>
+        <w:numPr>
+          <w:ilvl w:val="0"/>
+          <w:numId w:val="2"/>
+        </w:numPr>
+      </w:pPr>
+      <w:r>
+        <w:t xml:space="preserve">Giai đoạn 2: </w:t>
+      </w:r>
+      <w:r>
+        <w:t>Xây dựng cơ sở dữ liệu giao dịch</w:t>
+      </w:r>
+      <w:r>
+        <w:t xml:space="preserve"> SQL.</w:t>
+      </w:r>
+    </w:p>
+    <w:p>
+      <w:pPr>
+        <w:pStyle w:val="ListParagraph"/>
+        <w:numPr>
+          <w:ilvl w:val="1"/>
+          <w:numId w:val="2"/>
+        </w:numPr>
+      </w:pPr>
+      <w:r>
+        <w:t>Sau khi thu thập dữ liệu, các tệp CSV được nhập vào hệ quản trị cơ sở dữ liệu Microsoft SQL Server. Việc lưu trữ dữ liệu trong cơ sở dữ liệu quan hệ giúp đảm bảo tính nhất quán, toàn vẹn dữ liệu và hỗ trợ thực hiện các truy vấn phức tạp. Đồng thời, các khóa chính và khóa ngoại được thiết lập nhằm mô hình hóa mối quan hệ giữa các bảng dữ liệu.</w:t>
+      </w:r>
+    </w:p>
+    <w:p>
+      <w:pPr>
+        <w:pStyle w:val="ListParagraph"/>
+        <w:numPr>
+          <w:ilvl w:val="0"/>
+          <w:numId w:val="2"/>
+        </w:numPr>
+      </w:pPr>
+      <w:r>
+        <w:t xml:space="preserve">Giai đoạn 3: </w:t>
+      </w:r>
+      <w:r>
+        <w:t>Quy trình ETL (Extract – Transform – Load) được sử dụng để trích xuất dữ liệu từ cơ sở dữ liệu giao dịch, thực hiện các phép biến đổi dữ liệu và nạp dữ liệu vào kho dữ liệu.</w:t>
+      </w:r>
+    </w:p>
+    <w:p>
+      <w:pPr>
+        <w:pStyle w:val="ListParagraph"/>
+        <w:numPr>
+          <w:ilvl w:val="1"/>
+          <w:numId w:val="2"/>
+        </w:numPr>
+      </w:pPr>
+      <w:r>
+        <w:t>Trong bước này, các hoạt động xử lý bao gồm:</w:t>
+      </w:r>
+      <w:r>
+        <w:t xml:space="preserve"> làm sạch dữ liệu, loại bỏ dữ liệu trùng lặp, kiểm tra dữ liệu thiếu, chuẩn hóa định dạng dữ liệu, k</w:t>
+      </w:r>
+      <w:r>
+        <w:t>ết hợp dữ liệu từ nhiều bảng nguồn</w:t>
+      </w:r>
+      <w:r>
+        <w:t>, t</w:t>
+      </w:r>
+      <w:r>
+        <w:t>ạo các thuộc tính phân tích mới phục vụ báo cáo và mô hình học máy.</w:t>
+      </w:r>
+      <w:r>
+        <w:t xml:space="preserve"> </w:t>
+      </w:r>
+      <w:r>
+        <w:t>Quy trình ETL đóng vai trò quan trọng trong việc chuyển đổi dữ liệu tác nghiệp thành dữ liệu phân tích có cấu trúc.</w:t>
+      </w:r>
+    </w:p>
+    <w:p>
+      <w:pPr>
+        <w:pStyle w:val="ListParagraph"/>
+        <w:numPr>
+          <w:ilvl w:val="0"/>
+          <w:numId w:val="2"/>
+        </w:numPr>
+      </w:pPr>
+      <w:r>
+        <w:t>Gi</w:t>
+      </w:r>
+      <w:r>
+        <w:t>ai đoạn 4: Xây dựng kho dữ liệu.</w:t>
+      </w:r>
+    </w:p>
+    <w:p>
+      <w:pPr>
+        <w:pStyle w:val="ListParagraph"/>
+        <w:numPr>
+          <w:ilvl w:val="1"/>
+          <w:numId w:val="2"/>
+        </w:numPr>
+      </w:pPr>
+      <w:r>
+        <w:t xml:space="preserve">Sau khi được xử lý, dữ liệu được lưu trữ trong kho dữ liệu theo mô hình Star Schema. </w:t>
+      </w:r>
+    </w:p>
+    <w:p>
+      <w:pPr>
+        <w:pStyle w:val="ListParagraph"/>
+        <w:numPr>
+          <w:ilvl w:val="1"/>
+          <w:numId w:val="2"/>
+        </w:numPr>
+      </w:pPr>
+      <w:r>
+        <w:lastRenderedPageBreak/>
+        <w:t>Kho dữ liệu được thiết kế nhằm tối ưu cho các truy vấn phân tích đa chiều, hỗ trợ việc tổng hợp dữ liệu nhanh chóng và giảm tải cho hệ thống giao dịch.</w:t>
+      </w:r>
+      <w:r>
+        <w:t xml:space="preserve"> </w:t>
+      </w:r>
+      <w:r>
+        <w:t>Kho dữ liệu trở thành nguồn dữ liệu trung tâm phục vụ các hoạt động Business Intelligence và Machine Learning.</w:t>
+      </w:r>
+    </w:p>
+    <w:p>
+      <w:pPr>
+        <w:pStyle w:val="ListParagraph"/>
+        <w:numPr>
+          <w:ilvl w:val="0"/>
+          <w:numId w:val="2"/>
+        </w:numPr>
+      </w:pPr>
+      <w:r>
+        <w:t>Giai đoạn 5: Phân tích dữ liệu</w:t>
+      </w:r>
+    </w:p>
+    <w:p>
+      <w:pPr>
+        <w:pStyle w:val="ListParagraph"/>
+        <w:numPr>
+          <w:ilvl w:val="1"/>
+          <w:numId w:val="2"/>
+        </w:numPr>
+      </w:pPr>
+      <w:r>
+        <w:t>Dữ liệu trong kho dữ liệu được khai thác để thực hiện các hoạt động phân tích như:</w:t>
+      </w:r>
+      <w:r>
+        <w:t xml:space="preserve"> phân tích doanh thu, hiệu quả Marketing, hành vi khánh hàng, hiệu suất sản phẩm và xu hướng kinh doanh theo thời gian.</w:t>
+      </w:r>
+    </w:p>
+    <w:p>
+      <w:pPr>
+        <w:pStyle w:val="ListParagraph"/>
+        <w:numPr>
+          <w:ilvl w:val="1"/>
+          <w:numId w:val="2"/>
+        </w:numPr>
+      </w:pPr>
+      <w:r>
+        <w:t>Các kỹ thuật thống kê mô tả và trực quan hóa dữ liệu được áp dụng nhằm phát hiện các đặc điểm và quy luật tiềm ẩn trong dữ liệu.</w:t>
+      </w:r>
+    </w:p>
+    <w:p>
+      <w:pPr>
+        <w:pStyle w:val="ListParagraph"/>
+        <w:numPr>
+          <w:ilvl w:val="0"/>
+          <w:numId w:val="2"/>
+        </w:numPr>
+      </w:pPr>
+      <w:r>
+        <w:t>Giai đoạn 6: Xây dựng mô hình Machine Learning</w:t>
+      </w:r>
+    </w:p>
+    <w:p>
+      <w:pPr>
+        <w:pStyle w:val="ListParagraph"/>
+        <w:numPr>
+          <w:ilvl w:val="1"/>
+          <w:numId w:val="2"/>
+        </w:numPr>
+      </w:pPr>
+      <w:r>
+        <w:t>Dựa trên dữ liệu đã được tổng hợp từ Data Warehouse, các mô hình học máy được xây dựng nhằm hỗ trợ dự báo và ra quyết định.</w:t>
+      </w:r>
+      <w:r>
+        <w:t xml:space="preserve"> </w:t>
+      </w:r>
+      <w:r>
+        <w:t>Trong phạm vi đề tài, bài toán học máy được triển khai là:</w:t>
+      </w:r>
+    </w:p>
+    <w:p>
+      <w:pPr>
+        <w:pStyle w:val="ListParagraph"/>
+        <w:numPr>
+          <w:ilvl w:val="2"/>
+          <w:numId w:val="2"/>
+        </w:numPr>
+      </w:pPr>
+      <w:r>
+        <w:t>Dự đoán lợi nhuận của một phiên giao dịch</w:t>
+      </w:r>
+      <w:r>
+        <w:t>.</w:t>
+      </w:r>
+    </w:p>
+    <w:p>
+      <w:pPr>
+        <w:pStyle w:val="ListParagraph"/>
+        <w:numPr>
+          <w:ilvl w:val="1"/>
+          <w:numId w:val="2"/>
+        </w:numPr>
+      </w:pPr>
+      <w:r>
+        <w:t>Mô hình được huấn luyện trên tập dữ liệu đã được tiền xử lý, sử dụng các đặc trưng liên quan đến sản phẩm, marketing và thời gian nhằm dự đoán giá trị doanh thu tiềm năng của mỗi phiên truy cập.</w:t>
+      </w:r>
+    </w:p>
+    <w:p>
+      <w:r>
+        <w:t>3.3. Thiết kế kh dữ liệu</w:t>
+      </w:r>
+    </w:p>
+    <w:p>
+      <w:r>
+        <w:t xml:space="preserve">3.3.1. Lược đồ hình sao </w:t>
+      </w:r>
+    </w:p>
+    <w:p>
+      <w:r>
+        <w:t>3.3.2. Xây dựng kho dữ liệu</w:t>
+      </w:r>
+    </w:p>
     <w:p/>
     <w:p/>
     <w:sectPr>
@@ -1804,18 +2205,260 @@
     <wne:keymap wne:kcmPrimary="0232">
       <wne:acd wne:acdName="acd1"/>
     </wne:keymap>
+    <wne:keymap wne:kcmPrimary="0233">
+      <wne:acd wne:acdName="acd2"/>
+    </wne:keymap>
   </wne:keymaps>
   <wne:toolbars>
     <wne:acdManifest>
       <wne:acdEntry wne:acdName="acd0"/>
       <wne:acdEntry wne:acdName="acd1"/>
+      <wne:acdEntry wne:acdName="acd2"/>
     </wne:acdManifest>
   </wne:toolbars>
   <wne:acds>
     <wne:acd wne:argValue="AQAAAAEA" wne:acdName="acd0" wne:fciIndexBasedOn="0065"/>
     <wne:acd wne:argValue="AQAAAAIA" wne:acdName="acd1" wne:fciIndexBasedOn="0065"/>
+    <wne:acd wne:argValue="AQAAAAMA" wne:acdName="acd2" wne:fciIndexBasedOn="0065"/>
   </wne:acds>
 </wne:tcg>
+</file>
+
+<file path=word/numbering.xml><?xml version="1.0" encoding="utf-8"?>
+<w:numbering xmlns:wpc="http://schemas.microsoft.com/office/word/2010/wordprocessingCanvas" xmlns:cx="http://schemas.microsoft.com/office/drawing/2014/chartex" xmlns:cx1="http://schemas.microsoft.com/office/drawing/2015/9/8/chartex" xmlns:cx2="http://schemas.microsoft.com/office/drawing/2015/10/21/chartex" xmlns:cx3="http://schemas.microsoft.com/office/drawing/2016/5/9/chartex" xmlns:cx4="http://schemas.microsoft.com/office/drawing/2016/5/10/chartex" xmlns:cx5="http://schemas.microsoft.com/office/drawing/2016/5/11/chartex" xmlns:cx6="http://schemas.microsoft.com/office/drawing/2016/5/12/chartex" xmlns:cx7="http://schemas.microsoft.com/office/drawing/2016/5/13/chartex" xmlns:cx8="http://schemas.microsoft.com/office/drawing/2016/5/14/chartex" xmlns:mc="http://schemas.openxmlformats.org/markup-compatibility/2006" xmlns:aink="http://schemas.microsoft.com/office/drawing/2016/ink" xmlns:am3d="http://schemas.microsoft.com/office/drawing/2017/model3d" xmlns:o="urn:schemas-microsoft-com:office:office" xmlns:oel="http://schemas.microsoft.com/office/2019/extlst" xmlns:r="http://schemas.openxmlformats.org/officeDocument/2006/relationships" xmlns:m="http://schemas.openxmlformats.org/officeDocument/2006/math" xmlns:v="urn:schemas-microsoft-com:vml" xmlns:wp14="http://schemas.microsoft.com/office/word/2010/wordprocessingDrawing" xmlns:wp="http://schemas.openxmlformats.org/drawingml/2006/wordprocessingDrawing" xmlns:w10="urn:schemas-microsoft-com:office:word" xmlns:w="http://schemas.openxmlformats.org/wordprocessingml/2006/main" xmlns:w14="http://schemas.microsoft.com/office/word/2010/wordml" xmlns:w15="http://schemas.microsoft.com/office/word/2012/wordml" xmlns:w16cex="http://schemas.microsoft.com/office/word/2018/wordml/cex" xmlns:w16cid="http://schemas.microsoft.com/office/word/2016/wordml/cid" xmlns:w16="http://schemas.microsoft.com/office/word/2018/wordml" xmlns:w16du="http://schemas.microsoft.com/office/word/2023/wordml/word16du" xmlns:w16sdtdh="http://schemas.microsoft.com/office/word/2020/wordml/sdtdatahash" xmlns:w16sdtfl="http://schemas.microsoft.com/office/word/2024/wordml/sdtformatlock" xmlns:w16se="http://schemas.microsoft.com/office/word/2015/wordml/symex" xmlns:wpg="http://schemas.microsoft.com/office/word/2010/wordprocessingGroup" xmlns:wpi="http://schemas.microsoft.com/office/word/2010/wordprocessingInk" xmlns:wne="http://schemas.microsoft.com/office/word/2006/wordml" xmlns:wps="http://schemas.microsoft.com/office/word/2010/wordprocessingShape" mc:Ignorable="w14 w15 w16se w16cid w16 w16cex w16sdtdh w16sdtfl w16du wp14">
+  <w:abstractNum w:abstractNumId="0" w15:restartNumberingAfterBreak="0">
+    <w:nsid w:val="019A2015"/>
+    <w:multiLevelType w:val="hybridMultilevel"/>
+    <w:tmpl w:val="D012F6D0"/>
+    <w:lvl w:ilvl="0" w:tplc="2B1C1C56">
+      <w:start w:val="1"/>
+      <w:numFmt w:val="bullet"/>
+      <w:lvlText w:val=""/>
+      <w:lvlJc w:val="left"/>
+      <w:pPr>
+        <w:ind w:left="720" w:hanging="360"/>
+      </w:pPr>
+      <w:rPr>
+        <w:rFonts w:ascii="Symbol" w:hAnsi="Symbol" w:hint="default"/>
+      </w:rPr>
+    </w:lvl>
+    <w:lvl w:ilvl="1" w:tplc="26BC569E">
+      <w:start w:val="1"/>
+      <w:numFmt w:val="bullet"/>
+      <w:lvlText w:val="+"/>
+      <w:lvlJc w:val="left"/>
+      <w:pPr>
+        <w:ind w:left="1440" w:hanging="360"/>
+      </w:pPr>
+      <w:rPr>
+        <w:rFonts w:ascii="Courier New" w:hAnsi="Courier New" w:hint="default"/>
+      </w:rPr>
+    </w:lvl>
+    <w:lvl w:ilvl="2" w:tplc="0409000B">
+      <w:start w:val="1"/>
+      <w:numFmt w:val="bullet"/>
+      <w:lvlText w:val=""/>
+      <w:lvlJc w:val="left"/>
+      <w:pPr>
+        <w:ind w:left="2160" w:hanging="360"/>
+      </w:pPr>
+      <w:rPr>
+        <w:rFonts w:ascii="Wingdings" w:hAnsi="Wingdings" w:hint="default"/>
+      </w:rPr>
+    </w:lvl>
+    <w:lvl w:ilvl="3" w:tplc="FFFFFFFF" w:tentative="1">
+      <w:start w:val="1"/>
+      <w:numFmt w:val="bullet"/>
+      <w:lvlText w:val=""/>
+      <w:lvlJc w:val="left"/>
+      <w:pPr>
+        <w:ind w:left="2880" w:hanging="360"/>
+      </w:pPr>
+      <w:rPr>
+        <w:rFonts w:ascii="Symbol" w:hAnsi="Symbol" w:hint="default"/>
+      </w:rPr>
+    </w:lvl>
+    <w:lvl w:ilvl="4" w:tplc="FFFFFFFF" w:tentative="1">
+      <w:start w:val="1"/>
+      <w:numFmt w:val="bullet"/>
+      <w:lvlText w:val="o"/>
+      <w:lvlJc w:val="left"/>
+      <w:pPr>
+        <w:ind w:left="3600" w:hanging="360"/>
+      </w:pPr>
+      <w:rPr>
+        <w:rFonts w:ascii="Courier New" w:hAnsi="Courier New" w:cs="Courier New" w:hint="default"/>
+      </w:rPr>
+    </w:lvl>
+    <w:lvl w:ilvl="5" w:tplc="FFFFFFFF" w:tentative="1">
+      <w:start w:val="1"/>
+      <w:numFmt w:val="bullet"/>
+      <w:lvlText w:val=""/>
+      <w:lvlJc w:val="left"/>
+      <w:pPr>
+        <w:ind w:left="4320" w:hanging="360"/>
+      </w:pPr>
+      <w:rPr>
+        <w:rFonts w:ascii="Wingdings" w:hAnsi="Wingdings" w:hint="default"/>
+      </w:rPr>
+    </w:lvl>
+    <w:lvl w:ilvl="6" w:tplc="FFFFFFFF" w:tentative="1">
+      <w:start w:val="1"/>
+      <w:numFmt w:val="bullet"/>
+      <w:lvlText w:val=""/>
+      <w:lvlJc w:val="left"/>
+      <w:pPr>
+        <w:ind w:left="5040" w:hanging="360"/>
+      </w:pPr>
+      <w:rPr>
+        <w:rFonts w:ascii="Symbol" w:hAnsi="Symbol" w:hint="default"/>
+      </w:rPr>
+    </w:lvl>
+    <w:lvl w:ilvl="7" w:tplc="FFFFFFFF" w:tentative="1">
+      <w:start w:val="1"/>
+      <w:numFmt w:val="bullet"/>
+      <w:lvlText w:val="o"/>
+      <w:lvlJc w:val="left"/>
+      <w:pPr>
+        <w:ind w:left="5760" w:hanging="360"/>
+      </w:pPr>
+      <w:rPr>
+        <w:rFonts w:ascii="Courier New" w:hAnsi="Courier New" w:cs="Courier New" w:hint="default"/>
+      </w:rPr>
+    </w:lvl>
+    <w:lvl w:ilvl="8" w:tplc="FFFFFFFF" w:tentative="1">
+      <w:start w:val="1"/>
+      <w:numFmt w:val="bullet"/>
+      <w:lvlText w:val=""/>
+      <w:lvlJc w:val="left"/>
+      <w:pPr>
+        <w:ind w:left="6480" w:hanging="360"/>
+      </w:pPr>
+      <w:rPr>
+        <w:rFonts w:ascii="Wingdings" w:hAnsi="Wingdings" w:hint="default"/>
+      </w:rPr>
+    </w:lvl>
+  </w:abstractNum>
+  <w:abstractNum w:abstractNumId="1" w15:restartNumberingAfterBreak="0">
+    <w:nsid w:val="1C8711E8"/>
+    <w:multiLevelType w:val="hybridMultilevel"/>
+    <w:tmpl w:val="6D480326"/>
+    <w:lvl w:ilvl="0" w:tplc="04090001">
+      <w:start w:val="1"/>
+      <w:numFmt w:val="bullet"/>
+      <w:lvlText w:val=""/>
+      <w:lvlJc w:val="left"/>
+      <w:pPr>
+        <w:ind w:left="720" w:hanging="360"/>
+      </w:pPr>
+      <w:rPr>
+        <w:rFonts w:ascii="Symbol" w:hAnsi="Symbol" w:hint="default"/>
+      </w:rPr>
+    </w:lvl>
+    <w:lvl w:ilvl="1" w:tplc="04090003" w:tentative="1">
+      <w:start w:val="1"/>
+      <w:numFmt w:val="bullet"/>
+      <w:lvlText w:val="o"/>
+      <w:lvlJc w:val="left"/>
+      <w:pPr>
+        <w:ind w:left="1440" w:hanging="360"/>
+      </w:pPr>
+      <w:rPr>
+        <w:rFonts w:ascii="Courier New" w:hAnsi="Courier New" w:cs="Courier New" w:hint="default"/>
+      </w:rPr>
+    </w:lvl>
+    <w:lvl w:ilvl="2" w:tplc="04090005" w:tentative="1">
+      <w:start w:val="1"/>
+      <w:numFmt w:val="bullet"/>
+      <w:lvlText w:val=""/>
+      <w:lvlJc w:val="left"/>
+      <w:pPr>
+        <w:ind w:left="2160" w:hanging="360"/>
+      </w:pPr>
+      <w:rPr>
+        <w:rFonts w:ascii="Wingdings" w:hAnsi="Wingdings" w:hint="default"/>
+      </w:rPr>
+    </w:lvl>
+    <w:lvl w:ilvl="3" w:tplc="04090001" w:tentative="1">
+      <w:start w:val="1"/>
+      <w:numFmt w:val="bullet"/>
+      <w:lvlText w:val=""/>
+      <w:lvlJc w:val="left"/>
+      <w:pPr>
+        <w:ind w:left="2880" w:hanging="360"/>
+      </w:pPr>
+      <w:rPr>
+        <w:rFonts w:ascii="Symbol" w:hAnsi="Symbol" w:hint="default"/>
+      </w:rPr>
+    </w:lvl>
+    <w:lvl w:ilvl="4" w:tplc="04090003" w:tentative="1">
+      <w:start w:val="1"/>
+      <w:numFmt w:val="bullet"/>
+      <w:lvlText w:val="o"/>
+      <w:lvlJc w:val="left"/>
+      <w:pPr>
+        <w:ind w:left="3600" w:hanging="360"/>
+      </w:pPr>
+      <w:rPr>
+        <w:rFonts w:ascii="Courier New" w:hAnsi="Courier New" w:cs="Courier New" w:hint="default"/>
+      </w:rPr>
+    </w:lvl>
+    <w:lvl w:ilvl="5" w:tplc="04090005" w:tentative="1">
+      <w:start w:val="1"/>
+      <w:numFmt w:val="bullet"/>
+      <w:lvlText w:val=""/>
+      <w:lvlJc w:val="left"/>
+      <w:pPr>
+        <w:ind w:left="4320" w:hanging="360"/>
+      </w:pPr>
+      <w:rPr>
+        <w:rFonts w:ascii="Wingdings" w:hAnsi="Wingdings" w:hint="default"/>
+      </w:rPr>
+    </w:lvl>
+    <w:lvl w:ilvl="6" w:tplc="04090001" w:tentative="1">
+      <w:start w:val="1"/>
+      <w:numFmt w:val="bullet"/>
+      <w:lvlText w:val=""/>
+      <w:lvlJc w:val="left"/>
+      <w:pPr>
+        <w:ind w:left="5040" w:hanging="360"/>
+      </w:pPr>
+      <w:rPr>
+        <w:rFonts w:ascii="Symbol" w:hAnsi="Symbol" w:hint="default"/>
+      </w:rPr>
+    </w:lvl>
+    <w:lvl w:ilvl="7" w:tplc="04090003" w:tentative="1">
+      <w:start w:val="1"/>
+      <w:numFmt w:val="bullet"/>
+      <w:lvlText w:val="o"/>
+      <w:lvlJc w:val="left"/>
+      <w:pPr>
+        <w:ind w:left="5760" w:hanging="360"/>
+      </w:pPr>
+      <w:rPr>
+        <w:rFonts w:ascii="Courier New" w:hAnsi="Courier New" w:cs="Courier New" w:hint="default"/>
+      </w:rPr>
+    </w:lvl>
+    <w:lvl w:ilvl="8" w:tplc="04090005" w:tentative="1">
+      <w:start w:val="1"/>
+      <w:numFmt w:val="bullet"/>
+      <w:lvlText w:val=""/>
+      <w:lvlJc w:val="left"/>
+      <w:pPr>
+        <w:ind w:left="6480" w:hanging="360"/>
+      </w:pPr>
+      <w:rPr>
+        <w:rFonts w:ascii="Wingdings" w:hAnsi="Wingdings" w:hint="default"/>
+      </w:rPr>
+    </w:lvl>
+  </w:abstractNum>
+  <w:num w:numId="1" w16cid:durableId="2109042318">
+    <w:abstractNumId w:val="1"/>
+  </w:num>
+  <w:num w:numId="2" w16cid:durableId="116997589">
+    <w:abstractNumId w:val="0"/>
+  </w:num>
+</w:numbering>
 </file>
 
 <file path=word/styles.xml><?xml version="1.0" encoding="utf-8"?>
@@ -2247,7 +2890,6 @@
     <w:next w:val="Normal"/>
     <w:link w:val="Heading2Char"/>
     <w:uiPriority w:val="9"/>
-    <w:semiHidden/>
     <w:unhideWhenUsed/>
     <w:qFormat/>
     <w:rsid w:val="008D07A5"/>
@@ -2270,19 +2912,19 @@
     <w:next w:val="Normal"/>
     <w:link w:val="Heading3Char"/>
     <w:uiPriority w:val="9"/>
-    <w:semiHidden/>
     <w:unhideWhenUsed/>
     <w:qFormat/>
-    <w:rsid w:val="008D07A5"/>
+    <w:rsid w:val="007C3670"/>
     <w:pPr>
       <w:keepNext/>
       <w:keepLines/>
       <w:spacing w:before="160" w:after="80"/>
+      <w:jc w:val="both"/>
       <w:outlineLvl w:val="2"/>
     </w:pPr>
     <w:rPr>
-      <w:rFonts w:asciiTheme="minorHAnsi" w:eastAsiaTheme="majorEastAsia" w:hAnsiTheme="minorHAnsi" w:cstheme="majorBidi"/>
-      <w:color w:val="0F4761" w:themeColor="accent1" w:themeShade="BF"/>
+      <w:rFonts w:eastAsiaTheme="majorEastAsia" w:cstheme="majorBidi"/>
+      <w:i/>
       <w:sz w:val="28"/>
       <w:szCs w:val="28"/>
     </w:rPr>
@@ -2462,7 +3104,6 @@
     <w:basedOn w:val="DefaultParagraphFont"/>
     <w:link w:val="Heading2"/>
     <w:uiPriority w:val="9"/>
-    <w:semiHidden/>
     <w:rsid w:val="008D07A5"/>
     <w:rPr>
       <w:rFonts w:eastAsiaTheme="majorEastAsia" w:cstheme="majorBidi"/>
@@ -2475,11 +3116,10 @@
     <w:basedOn w:val="DefaultParagraphFont"/>
     <w:link w:val="Heading3"/>
     <w:uiPriority w:val="9"/>
-    <w:semiHidden/>
-    <w:rsid w:val="008D07A5"/>
+    <w:rsid w:val="007C3670"/>
     <w:rPr>
-      <w:rFonts w:asciiTheme="minorHAnsi" w:eastAsiaTheme="majorEastAsia" w:hAnsiTheme="minorHAnsi" w:cstheme="majorBidi"/>
-      <w:color w:val="0F4761" w:themeColor="accent1" w:themeShade="BF"/>
+      <w:rFonts w:eastAsiaTheme="majorEastAsia" w:cstheme="majorBidi"/>
+      <w:i/>
       <w:sz w:val="28"/>
       <w:szCs w:val="28"/>
     </w:rPr>

</xml_diff>

<commit_message>
docs: add content star schema data warehouse
</commit_message>
<xml_diff>
--- a/reports/words/chuong_3.docx
+++ b/reports/words/chuong_3.docx
@@ -2064,13 +2064,7 @@
       </w:pPr>
       <w:r>
         <w:lastRenderedPageBreak/>
-        <w:t>Kho dữ liệu được thiết kế nhằm tối ưu cho các truy vấn phân tích đa chiều, hỗ trợ việc tổng hợp dữ liệu nhanh chóng và giảm tải cho hệ thống giao dịch.</w:t>
-      </w:r>
-      <w:r>
-        <w:t xml:space="preserve"> </w:t>
-      </w:r>
-      <w:r>
-        <w:t>Kho dữ liệu trở thành nguồn dữ liệu trung tâm phục vụ các hoạt động Business Intelligence và Machine Learning.</w:t>
+        <w:t>Kho dữ liệu được thiết kế nhằm tối ưu cho các truy vấn phân tích đa chiều, hỗ trợ việc tổng hợp dữ liệu nhanh chóng và giảm tải cho hệ thống giao dịch. Kho dữ liệu trở thành nguồn dữ liệu trung tâm phục vụ các hoạt động Business Intelligence và Machine Learning.</w:t>
       </w:r>
     </w:p>
     <w:p>
@@ -2171,7 +2165,13 @@
     </w:p>
     <w:p>
       <w:r>
-        <w:t>3.3. Thiết kế kh dữ liệu</w:t>
+        <w:t>3.3. Thiết kế kh</w:t>
+      </w:r>
+      <w:r>
+        <w:t>o</w:t>
+      </w:r>
+      <w:r>
+        <w:t xml:space="preserve"> dữ liệu</w:t>
       </w:r>
     </w:p>
     <w:p>
@@ -3064,6 +3064,7 @@
   <w:style w:type="character" w:default="1" w:styleId="DefaultParagraphFont">
     <w:name w:val="Default Paragraph Font"/>
     <w:uiPriority w:val="1"/>
+    <w:semiHidden/>
     <w:unhideWhenUsed/>
   </w:style>
   <w:style w:type="table" w:default="1" w:styleId="TableNormal">

</xml_diff>